<commit_message>
Make offline project operations reliable and recoverable
Integrate agent execution, schedule planning, deployment hardening, backup controls, and recoverable Gantt task deletion into one deployable update.

Constraint: Must support offline Windows and low-resource intranet deployments

Rejected: Split the currently staged cross-cutting update into artificial partial commits | The features share schema, API, UI, deployment, and documentation changes already staged together

Confidence: high

Scope-risk: broad

Directive: Apply all manual Prisma migrations before serving this revision against an existing database

Tested: npm run typecheck; targeted Gantt component tests (10 passed)

Not-tested: Full test suite; production build runs immediately after this commit
</commit_message>
<xml_diff>
--- a/dev-repo/Code/deployment/windows-x86/更新手册.docx
+++ b/dev-repo/Code/deployment/windows-x86/更新手册.docx
@@ -92,7 +92,7 @@
                 <w:sz w:val="22"/>
                 <w:lang w:val="zh-CN" w:eastAsia="zh-CN"/>
               </w:rPr>
-              <w:t>2026.07.27.1</w:t>
+              <w:t>2026.07.30.1</w:t>
             </w:r>
           </w:p>
         </w:tc>
@@ -748,7 +748,7 @@
         </w:rPr>
         <w:t>D:\PMS\Ceastar-PMS-内网完整部署-20260723\docker-compose.yml</w:t>
         <w:br/>
-        <w:t>D:\PMS\Ceastar-PMS-内网完整部署-20260723\Ceastar-PMS-更新包-20260727-1\update.bat</w:t>
+        <w:t>D:\PMS\Ceastar-PMS-内网完整部署-20260723\Ceastar-PMS-Update-20260730-1\update.bat</w:t>
       </w:r>
     </w:p>
     <w:p>
@@ -891,6 +891,68 @@
                 <w:lang w:val="zh-CN" w:eastAsia="zh-CN"/>
               </w:rPr>
               <w:t>PostgreSQL 数据卷、上传文档卷、Windows 上的 Ollama 安装与模型目录，以及已存在的备份文件。</w:t>
+            </w:r>
+          </w:p>
+        </w:tc>
+      </w:tr>
+    </w:tbl>
+    <w:p>
+      <w:pPr>
+        <w:spacing w:after="40"/>
+      </w:pPr>
+    </w:p>
+    <w:tbl>
+      <w:tblPr>
+        <w:tblW w:type="dxa" w:w="9360"/>
+        <w:jc w:val="left"/>
+        <w:tblLayout w:type="fixed"/>
+        <w:tblLook w:firstColumn="1" w:firstRow="1" w:lastColumn="0" w:lastRow="0" w:noHBand="0" w:noVBand="1" w:val="04A0"/>
+        <w:tblInd w:w="120" w:type="dxa"/>
+      </w:tblPr>
+      <w:tblGrid>
+        <w:gridCol w:w="9360"/>
+      </w:tblGrid>
+      <w:tr>
+        <w:tc>
+          <w:tcPr>
+            <w:tcW w:type="dxa" w:w="9360"/>
+            <w:tcMar>
+              <w:top w:w="80" w:type="dxa"/>
+              <w:start w:w="120" w:type="dxa"/>
+              <w:bottom w:w="80" w:type="dxa"/>
+              <w:end w:w="120" w:type="dxa"/>
+            </w:tcMar>
+            <w:vAlign w:val="center"/>
+            <w:shd w:fill="E8EEF5"/>
+          </w:tcPr>
+          <w:p>
+            <w:pPr>
+              <w:spacing w:after="40"/>
+            </w:pPr>
+            <w:r>
+              <w:rPr>
+                <w:rFonts w:ascii="Microsoft YaHei" w:hAnsi="Microsoft YaHei" w:eastAsia="Microsoft YaHei"/>
+                <w:b/>
+                <w:color w:val="1F4D78"/>
+                <w:sz w:val="22"/>
+                <w:lang w:val="zh-CN" w:eastAsia="zh-CN"/>
+              </w:rPr>
+              <w:t>MPP 导出服务说明</w:t>
+            </w:r>
+          </w:p>
+          <w:p>
+            <w:pPr>
+              <w:spacing w:after="0" w:line="288" w:lineRule="auto"/>
+            </w:pPr>
+            <w:r>
+              <w:rPr>
+                <w:rFonts w:ascii="Microsoft YaHei" w:hAnsi="Microsoft YaHei" w:eastAsia="Microsoft YaHei"/>
+                <w:b w:val="0"/>
+                <w:color w:val="1E242C"/>
+                <w:sz w:val="22"/>
+                <w:lang w:val="zh-CN" w:eastAsia="zh-CN"/>
+              </w:rPr>
+              <w:t>更新脚本不会自动启动 Microsoft Project 或注册 MPP 导出服务，避免 Project 自动化或权限窗口阻塞更新。系统更新完成后，如确实需要导出二进制 MPP 文件，再右键以管理员身份运行 repair-mpp-export-service.bat。Excel 和 Project XML 导出不受影响。</w:t>
             </w:r>
           </w:p>
         </w:tc>

</xml_diff>